<commit_message>
se añadieron los documentos 2.1 y se mejoro el 2.4
</commit_message>
<xml_diff>
--- a/Documentación Capstone/Fase 2/Evidencias Grupales/2.4_GuiaEstudiante_Fase 2_DesarrolloProyecto APT.docx
+++ b/Documentación Capstone/Fase 2/Evidencias Grupales/2.4_GuiaEstudiante_Fase 2_DesarrolloProyecto APT.docx
@@ -33,7 +33,7 @@
               <wp:anchor allowOverlap="1" behindDoc="0" distB="0" distT="0" distL="114300" distR="114300" hidden="0" layoutInCell="1" locked="0" relativeHeight="0" simplePos="0">
                 <wp:simplePos x="0" y="0"/>
                 <wp:positionH relativeFrom="column">
-                  <wp:posOffset>1</wp:posOffset>
+                  <wp:posOffset>2</wp:posOffset>
                 </wp:positionH>
                 <wp:positionV relativeFrom="paragraph">
                   <wp:posOffset>9525</wp:posOffset>
@@ -41,7 +41,7 @@
                 <wp:extent cx="6238875" cy="1562100"/>
                 <wp:effectExtent b="0" l="0" r="0" t="0"/>
                 <wp:wrapNone/>
-                <wp:docPr id="28" name=""/>
+                <wp:docPr id="34" name=""/>
                 <a:graphic>
                   <a:graphicData uri="http://schemas.microsoft.com/office/word/2010/wordprocessingGroup">
                     <wpg:wgp>
@@ -60,8 +60,8 @@
                           <a:xfrm>
                             <a:off x="2226563" y="2998950"/>
                             <a:ext cx="6238875" cy="1562100"/>
-                            <a:chOff x="0" y="0"/>
-                            <a:chExt cx="5991225" cy="1562100"/>
+                            <a:chOff x="2226550" y="2998950"/>
+                            <a:chExt cx="6238900" cy="1562100"/>
                           </a:xfrm>
                         </wpg:grpSpPr>
                         <wps:wsp>
@@ -69,8 +69,8 @@
                           <wps:cNvPr id="3" name="Shape 3"/>
                           <wps:spPr>
                             <a:xfrm>
-                              <a:off x="0" y="0"/>
-                              <a:ext cx="5991225" cy="1562100"/>
+                              <a:off x="2226550" y="2998950"/>
+                              <a:ext cx="6238900" cy="1562100"/>
                             </a:xfrm>
                             <a:prstGeom prst="rect">
                               <a:avLst/>
@@ -96,138 +96,181 @@
                             <a:noAutofit/>
                           </wps:bodyPr>
                         </wps:wsp>
-                        <wps:wsp>
-                          <wps:cNvSpPr/>
-                          <wps:cNvPr id="4" name="Shape 4"/>
-                          <wps:spPr>
+                        <wpg:grpSp>
+                          <wpg:cNvGrpSpPr/>
+                          <wpg:grpSpPr>
                             <a:xfrm>
-                              <a:off x="1024671" y="299473"/>
-                              <a:ext cx="4966554" cy="1262627"/>
+                              <a:off x="2226563" y="2998950"/>
+                              <a:ext cx="6238875" cy="1562100"/>
+                              <a:chOff x="0" y="0"/>
+                              <a:chExt cx="5991225" cy="1562100"/>
                             </a:xfrm>
-                            <a:prstGeom prst="rect">
-                              <a:avLst/>
-                            </a:prstGeom>
-                            <a:noFill/>
-                            <a:ln>
+                          </wpg:grpSpPr>
+                          <wps:wsp>
+                            <wps:cNvSpPr/>
+                            <wps:cNvPr id="5" name="Shape 5"/>
+                            <wps:spPr>
+                              <a:xfrm>
+                                <a:off x="0" y="0"/>
+                                <a:ext cx="5991225" cy="1562100"/>
+                              </a:xfrm>
+                              <a:prstGeom prst="rect">
+                                <a:avLst/>
+                              </a:prstGeom>
                               <a:noFill/>
-                            </a:ln>
-                          </wps:spPr>
-                          <wps:txbx>
-                            <w:txbxContent>
-                              <w:p>
-                                <w:pPr>
-                                  <w:spacing w:after="0" w:before="0" w:line="240"/>
-                                  <w:ind w:left="0" w:right="0" w:firstLine="0"/>
-                                  <w:jc w:val="left"/>
-                                  <w:textDirection w:val="btLr"/>
-                                </w:pPr>
-                              </w:p>
-                              <w:p>
-                                <w:pPr>
-                                  <w:spacing w:after="0" w:before="0" w:line="240"/>
-                                  <w:ind w:left="0" w:right="0" w:firstLine="0"/>
-                                  <w:jc w:val="left"/>
-                                  <w:textDirection w:val="btLr"/>
-                                </w:pPr>
-                                <w:r>
-                                  <w:rPr>
-                                    <w:rFonts w:ascii="Calibri" w:cs="Calibri" w:eastAsia="Calibri" w:hAnsi="Calibri"/>
-                                    <w:b w:val="1"/>
-                                    <w:i w:val="0"/>
-                                    <w:smallCaps w:val="0"/>
-                                    <w:strike w:val="0"/>
-                                    <w:color w:val="ff0000"/>
-                                    <w:sz w:val="48"/>
-                                    <w:vertAlign w:val="baseline"/>
-                                  </w:rPr>
-                                </w:r>
-                                <w:r>
-                                  <w:rPr>
-                                    <w:rFonts w:ascii="Calibri" w:cs="Calibri" w:eastAsia="Calibri" w:hAnsi="Calibri"/>
-                                    <w:b w:val="1"/>
-                                    <w:i w:val="0"/>
-                                    <w:smallCaps w:val="0"/>
-                                    <w:strike w:val="0"/>
-                                    <w:color w:val="1f3864"/>
-                                    <w:sz w:val="48"/>
-                                    <w:vertAlign w:val="baseline"/>
-                                  </w:rPr>
-                                  <w:t xml:space="preserve">Guía2. Desarrollo Proyecto APT </w:t>
-                                </w:r>
-                              </w:p>
-                              <w:p>
-                                <w:pPr>
-                                  <w:spacing w:after="0" w:before="0" w:line="240"/>
-                                  <w:ind w:left="0" w:right="0" w:firstLine="0"/>
-                                  <w:jc w:val="left"/>
-                                  <w:textDirection w:val="btLr"/>
-                                </w:pPr>
-                                <w:r>
-                                  <w:rPr>
-                                    <w:rFonts w:ascii="Calibri" w:cs="Calibri" w:eastAsia="Calibri" w:hAnsi="Calibri"/>
-                                    <w:b w:val="1"/>
-                                    <w:i w:val="0"/>
-                                    <w:smallCaps w:val="0"/>
-                                    <w:strike w:val="0"/>
-                                    <w:color w:val="1f3864"/>
-                                    <w:sz w:val="48"/>
-                                    <w:vertAlign w:val="baseline"/>
-                                  </w:rPr>
-                                </w:r>
-                                <w:r>
-                                  <w:rPr>
-                                    <w:rFonts w:ascii="Calibri" w:cs="Calibri" w:eastAsia="Calibri" w:hAnsi="Calibri"/>
-                                    <w:b w:val="1"/>
-                                    <w:i w:val="0"/>
-                                    <w:smallCaps w:val="0"/>
-                                    <w:strike w:val="0"/>
-                                    <w:color w:val="1f3864"/>
-                                    <w:sz w:val="48"/>
-                                    <w:vertAlign w:val="baseline"/>
-                                  </w:rPr>
-                                  <w:t xml:space="preserve">Asignatura Capstone</w:t>
-                                </w:r>
-                              </w:p>
-                            </w:txbxContent>
-                          </wps:txbx>
-                          <wps:bodyPr anchorCtr="0" anchor="t" bIns="45700" lIns="91425" spcFirstLastPara="1" rIns="91425" wrap="square" tIns="45700">
-                            <a:noAutofit/>
-                          </wps:bodyPr>
-                        </wps:wsp>
-                        <wps:wsp>
-                          <wps:cNvSpPr/>
-                          <wps:cNvPr id="5" name="Shape 5"/>
-                          <wps:spPr>
-                            <a:xfrm>
-                              <a:off x="0" y="0"/>
-                              <a:ext cx="993140" cy="1486894"/>
-                            </a:xfrm>
-                            <a:prstGeom prst="rect">
-                              <a:avLst/>
-                            </a:prstGeom>
-                            <a:solidFill>
-                              <a:srgbClr val="1F3864"/>
-                            </a:solidFill>
-                            <a:ln>
+                              <a:ln>
+                                <a:noFill/>
+                              </a:ln>
+                            </wps:spPr>
+                            <wps:txbx>
+                              <w:txbxContent>
+                                <w:p>
+                                  <w:pPr>
+                                    <w:spacing w:after="0" w:before="0" w:line="240"/>
+                                    <w:ind w:left="0" w:right="0" w:firstLine="0"/>
+                                    <w:jc w:val="left"/>
+                                    <w:textDirection w:val="btLr"/>
+                                  </w:pPr>
+                                </w:p>
+                              </w:txbxContent>
+                            </wps:txbx>
+                            <wps:bodyPr anchorCtr="0" anchor="ctr" bIns="91425" lIns="91425" spcFirstLastPara="1" rIns="91425" wrap="square" tIns="91425">
+                              <a:noAutofit/>
+                            </wps:bodyPr>
+                          </wps:wsp>
+                          <wps:wsp>
+                            <wps:cNvSpPr/>
+                            <wps:cNvPr id="6" name="Shape 6"/>
+                            <wps:spPr>
+                              <a:xfrm>
+                                <a:off x="1024671" y="299473"/>
+                                <a:ext cx="4966554" cy="1262627"/>
+                              </a:xfrm>
+                              <a:prstGeom prst="rect">
+                                <a:avLst/>
+                              </a:prstGeom>
                               <a:noFill/>
-                            </a:ln>
-                          </wps:spPr>
-                          <wps:txbx>
-                            <w:txbxContent>
-                              <w:p>
-                                <w:pPr>
-                                  <w:spacing w:after="0" w:before="0" w:line="240"/>
-                                  <w:ind w:left="0" w:right="0" w:firstLine="0"/>
-                                  <w:jc w:val="left"/>
-                                  <w:textDirection w:val="btLr"/>
-                                </w:pPr>
-                              </w:p>
-                            </w:txbxContent>
-                          </wps:txbx>
-                          <wps:bodyPr anchorCtr="0" anchor="ctr" bIns="91425" lIns="91425" spcFirstLastPara="1" rIns="91425" wrap="square" tIns="91425">
-                            <a:noAutofit/>
-                          </wps:bodyPr>
-                        </wps:wsp>
+                              <a:ln>
+                                <a:noFill/>
+                              </a:ln>
+                            </wps:spPr>
+                            <wps:txbx>
+                              <w:txbxContent>
+                                <w:p>
+                                  <w:pPr>
+                                    <w:spacing w:after="0" w:before="0" w:line="240"/>
+                                    <w:ind w:left="0" w:right="0" w:firstLine="0"/>
+                                    <w:jc w:val="left"/>
+                                    <w:textDirection w:val="btLr"/>
+                                  </w:pPr>
+                                </w:p>
+                                <w:p>
+                                  <w:pPr>
+                                    <w:spacing w:after="0" w:before="0" w:line="240"/>
+                                    <w:ind w:left="0" w:right="0" w:firstLine="0"/>
+                                    <w:jc w:val="left"/>
+                                    <w:textDirection w:val="btLr"/>
+                                  </w:pPr>
+                                  <w:r>
+                                    <w:rPr>
+                                      <w:rFonts w:ascii="Arial" w:cs="Arial" w:eastAsia="Arial" w:hAnsi="Arial"/>
+                                      <w:b w:val="0"/>
+                                      <w:i w:val="0"/>
+                                      <w:smallCaps w:val="0"/>
+                                      <w:strike w:val="0"/>
+                                      <w:color w:val="000000"/>
+                                      <w:sz w:val="28"/>
+                                      <w:vertAlign w:val="baseline"/>
+                                    </w:rPr>
+                                  </w:r>
+                                  <w:r>
+                                    <w:rPr>
+                                      <w:rFonts w:ascii="Calibri" w:cs="Calibri" w:eastAsia="Calibri" w:hAnsi="Calibri"/>
+                                      <w:b w:val="1"/>
+                                      <w:i w:val="0"/>
+                                      <w:smallCaps w:val="0"/>
+                                      <w:strike w:val="0"/>
+                                      <w:color w:val="1f3864"/>
+                                      <w:sz w:val="48"/>
+                                      <w:vertAlign w:val="baseline"/>
+                                    </w:rPr>
+                                    <w:t xml:space="preserve">Guía2. Desarrollo Proyecto APT </w:t>
+                                  </w:r>
+                                </w:p>
+                                <w:p>
+                                  <w:pPr>
+                                    <w:spacing w:after="0" w:before="0" w:line="240"/>
+                                    <w:ind w:left="0" w:right="0" w:firstLine="0"/>
+                                    <w:jc w:val="left"/>
+                                    <w:textDirection w:val="btLr"/>
+                                  </w:pPr>
+                                  <w:r>
+                                    <w:rPr>
+                                      <w:rFonts w:ascii="Calibri" w:cs="Calibri" w:eastAsia="Calibri" w:hAnsi="Calibri"/>
+                                      <w:b w:val="1"/>
+                                      <w:i w:val="0"/>
+                                      <w:smallCaps w:val="0"/>
+                                      <w:strike w:val="0"/>
+                                      <w:color w:val="1f3864"/>
+                                      <w:sz w:val="48"/>
+                                      <w:vertAlign w:val="baseline"/>
+                                    </w:rPr>
+                                  </w:r>
+                                  <w:r>
+                                    <w:rPr>
+                                      <w:rFonts w:ascii="Calibri" w:cs="Calibri" w:eastAsia="Calibri" w:hAnsi="Calibri"/>
+                                      <w:b w:val="1"/>
+                                      <w:i w:val="0"/>
+                                      <w:smallCaps w:val="0"/>
+                                      <w:strike w:val="0"/>
+                                      <w:color w:val="1f3864"/>
+                                      <w:sz w:val="48"/>
+                                      <w:vertAlign w:val="baseline"/>
+                                    </w:rPr>
+                                    <w:t xml:space="preserve">Asignatura Capstone</w:t>
+                                  </w:r>
+                                </w:p>
+                              </w:txbxContent>
+                            </wps:txbx>
+                            <wps:bodyPr anchorCtr="0" anchor="t" bIns="45700" lIns="91425" spcFirstLastPara="1" rIns="91425" wrap="square" tIns="45700">
+                              <a:noAutofit/>
+                            </wps:bodyPr>
+                          </wps:wsp>
+                          <wps:wsp>
+                            <wps:cNvSpPr/>
+                            <wps:cNvPr id="7" name="Shape 7"/>
+                            <wps:spPr>
+                              <a:xfrm>
+                                <a:off x="0" y="0"/>
+                                <a:ext cx="993140" cy="1486894"/>
+                              </a:xfrm>
+                              <a:prstGeom prst="rect">
+                                <a:avLst/>
+                              </a:prstGeom>
+                              <a:solidFill>
+                                <a:srgbClr val="1F3864"/>
+                              </a:solidFill>
+                              <a:ln>
+                                <a:noFill/>
+                              </a:ln>
+                            </wps:spPr>
+                            <wps:txbx>
+                              <w:txbxContent>
+                                <w:p>
+                                  <w:pPr>
+                                    <w:spacing w:after="0" w:before="0" w:line="240"/>
+                                    <w:ind w:left="0" w:right="0" w:firstLine="0"/>
+                                    <w:jc w:val="left"/>
+                                    <w:textDirection w:val="btLr"/>
+                                  </w:pPr>
+                                </w:p>
+                              </w:txbxContent>
+                            </wps:txbx>
+                            <wps:bodyPr anchorCtr="0" anchor="ctr" bIns="91425" lIns="91425" spcFirstLastPara="1" rIns="91425" wrap="square" tIns="91425">
+                              <a:noAutofit/>
+                            </wps:bodyPr>
+                          </wps:wsp>
+                        </wpg:grpSp>
                       </wpg:grpSp>
                     </wpg:wgp>
                   </a:graphicData>
@@ -240,7 +283,7 @@
               <wp:anchor allowOverlap="1" behindDoc="0" distB="0" distT="0" distL="114300" distR="114300" hidden="0" layoutInCell="1" locked="0" relativeHeight="0" simplePos="0">
                 <wp:simplePos x="0" y="0"/>
                 <wp:positionH relativeFrom="column">
-                  <wp:posOffset>1</wp:posOffset>
+                  <wp:posOffset>2</wp:posOffset>
                 </wp:positionH>
                 <wp:positionV relativeFrom="paragraph">
                   <wp:posOffset>9525</wp:posOffset>
@@ -248,12 +291,12 @@
                 <wp:extent cx="6238875" cy="1562100"/>
                 <wp:effectExtent b="0" l="0" r="0" t="0"/>
                 <wp:wrapNone/>
-                <wp:docPr id="28" name="image6.png"/>
+                <wp:docPr id="34" name="image8.png"/>
                 <a:graphic>
                   <a:graphicData uri="http://schemas.openxmlformats.org/drawingml/2006/picture">
                     <pic:pic>
                       <pic:nvPicPr>
-                        <pic:cNvPr id="0" name="image6.png"/>
+                        <pic:cNvPr id="0" name="image8.png"/>
                         <pic:cNvPicPr preferRelativeResize="0"/>
                       </pic:nvPicPr>
                       <pic:blipFill>
@@ -438,7 +481,6 @@
             <w:pPr>
               <w:keepNext w:val="0"/>
               <w:keepLines w:val="0"/>
-              <w:pageBreakBefore w:val="0"/>
               <w:widowControl w:val="1"/>
               <w:pBdr>
                 <w:top w:space="0" w:sz="0" w:val="nil"/>
@@ -641,9 +683,6 @@
             <w:pPr>
               <w:jc w:val="both"/>
               <w:rPr>
-                <w:rFonts w:ascii="Calibri" w:cs="Calibri" w:eastAsia="Calibri" w:hAnsi="Calibri"/>
-                <w:b w:val="1"/>
-                <w:bCs w:val="1"/>
                 <w:color w:val="548dd4"/>
                 <w:sz w:val="20"/>
                 <w:szCs w:val="20"/>
@@ -651,13 +690,50 @@
             </w:pPr>
             <w:r>
               <w:rPr>
-                <w:rFonts w:ascii="Calibri" w:cs="Calibri" w:eastAsia="Calibri" w:hAnsi="Calibri"/>
                 <w:color w:val="548dd4"/>
                 <w:sz w:val="20"/>
                 <w:szCs w:val="20"/>
                 <w:rtl w:val="0"/>
               </w:rPr>
-              <w:t xml:space="preserve">Opcional en caso de ajuste</w:t>
+              <w:t xml:space="preserve">Desarrollar nuevas actividades de realidad virtual para estimular funciones cognitivas en adultos mayores.</w:t>
+            </w:r>
+          </w:p>
+          <w:p>
+            <w:pPr>
+              <w:jc w:val="both"/>
+              <w:rPr>
+                <w:color w:val="548dd4"/>
+                <w:sz w:val="20"/>
+                <w:szCs w:val="20"/>
+              </w:rPr>
+            </w:pPr>
+            <w:r>
+              <w:rPr>
+                <w:color w:val="548dd4"/>
+                <w:sz w:val="20"/>
+                <w:szCs w:val="20"/>
+                <w:rtl w:val="0"/>
+              </w:rPr>
+              <w:t xml:space="preserve">Implementar un sistema de telemetría para recopilar métricas clínicas durante las sesiones.</w:t>
+            </w:r>
+          </w:p>
+          <w:p>
+            <w:pPr>
+              <w:jc w:val="both"/>
+              <w:rPr>
+                <w:color w:val="548dd4"/>
+                <w:sz w:val="20"/>
+                <w:szCs w:val="20"/>
+              </w:rPr>
+            </w:pPr>
+            <w:r>
+              <w:rPr>
+                <w:color w:val="548dd4"/>
+                <w:sz w:val="20"/>
+                <w:szCs w:val="20"/>
+                <w:rtl w:val="0"/>
+              </w:rPr>
+              <w:t xml:space="preserve">Crear un dashboard móvil con apoyo de IA para visualizar y analizar los datos obtenidos.</w:t>
             </w:r>
             <w:r>
               <w:rPr>
@@ -709,18 +785,12 @@
             </w:pPr>
             <w:r>
               <w:rPr>
-                <w:rFonts w:ascii="Calibri" w:cs="Calibri" w:eastAsia="Calibri" w:hAnsi="Calibri"/>
                 <w:color w:val="548dd4"/>
                 <w:sz w:val="20"/>
                 <w:szCs w:val="20"/>
                 <w:rtl w:val="0"/>
               </w:rPr>
-              <w:t xml:space="preserve">Opcional en caso de ajuste</w:t>
-            </w:r>
-            <w:r>
-              <w:rPr>
-                <w:rtl w:val="0"/>
-              </w:rPr>
+              <w:t xml:space="preserve">Metodología Ágil Scrum Master / KANBAN - JIRA </w:t>
             </w:r>
           </w:p>
         </w:tc>
@@ -744,11 +814,15 @@
             </w:pPr>
             <w:r>
               <w:rPr>
-                <w:rFonts w:ascii="Calibri" w:cs="Calibri" w:eastAsia="Calibri" w:hAnsi="Calibri"/>
-                <w:color w:val="1f3864"/>
-                <w:rtl w:val="0"/>
-              </w:rPr>
-              <w:t xml:space="preserve">Evidencias de avance</w:t>
+                <w:color w:val="1f3864"/>
+                <w:rtl w:val="0"/>
+              </w:rPr>
+              <w:t xml:space="preserve">Desarrollo de los scripts para el prompt inicial, monitoreo y benchmark del modelo de IA en base al prompt y datos de pacientes simulados.</w:t>
+            </w:r>
+            <w:r>
+              <w:rPr>
+                <w:rtl w:val="0"/>
+              </w:rPr>
             </w:r>
           </w:p>
         </w:tc>
@@ -775,12 +849,12 @@
                 <wp:inline distB="114300" distT="114300" distL="114300" distR="114300">
                   <wp:extent cx="4514850" cy="2514600"/>
                   <wp:effectExtent b="0" l="0" r="0" t="0"/>
-                  <wp:docPr id="32" name="image2.png"/>
+                  <wp:docPr id="37" name="image3.png"/>
                   <a:graphic>
                     <a:graphicData uri="http://schemas.openxmlformats.org/drawingml/2006/picture">
                       <pic:pic>
                         <pic:nvPicPr>
-                          <pic:cNvPr id="0" name="image2.png"/>
+                          <pic:cNvPr id="0" name="image3.png"/>
                           <pic:cNvPicPr preferRelativeResize="0"/>
                         </pic:nvPicPr>
                         <pic:blipFill>
@@ -829,12 +903,12 @@
                 <wp:inline distB="114300" distT="114300" distL="114300" distR="114300">
                   <wp:extent cx="4514850" cy="4229100"/>
                   <wp:effectExtent b="0" l="0" r="0" t="0"/>
-                  <wp:docPr id="29" name="image3.png"/>
+                  <wp:docPr id="38" name="image4.png"/>
                   <a:graphic>
                     <a:graphicData uri="http://schemas.openxmlformats.org/drawingml/2006/picture">
                       <pic:pic>
                         <pic:nvPicPr>
-                          <pic:cNvPr id="0" name="image3.png"/>
+                          <pic:cNvPr id="0" name="image4.png"/>
                           <pic:cNvPicPr preferRelativeResize="0"/>
                         </pic:nvPicPr>
                         <pic:blipFill>
@@ -875,6 +949,84 @@
             </w:pPr>
             <w:r>
               <w:rPr>
+                <w:rtl w:val="0"/>
+              </w:rPr>
+            </w:r>
+          </w:p>
+          <w:p>
+            <w:pPr>
+              <w:jc w:val="both"/>
+              <w:rPr>
+                <w:color w:val="548dd4"/>
+                <w:sz w:val="20"/>
+                <w:szCs w:val="20"/>
+              </w:rPr>
+            </w:pPr>
+            <w:r>
+              <w:rPr>
+                <w:rtl w:val="0"/>
+              </w:rPr>
+            </w:r>
+          </w:p>
+        </w:tc>
+      </w:tr>
+      <w:tr>
+        <w:trPr>
+          <w:cantSplit w:val="0"/>
+          <w:trHeight w:val="2377" w:hRule="atLeast"/>
+          <w:tblHeader w:val="0"/>
+        </w:trPr>
+        <w:tc>
+          <w:tcPr>
+            <w:vAlign w:val="center"/>
+          </w:tcPr>
+          <w:p>
+            <w:pPr>
+              <w:spacing w:line="342.85714285714283" w:lineRule="auto"/>
+              <w:rPr>
+                <w:color w:val="1f3864"/>
+                <w:sz w:val="21"/>
+                <w:szCs w:val="21"/>
+              </w:rPr>
+            </w:pPr>
+            <w:r>
+              <w:rPr>
+                <w:color w:val="1f3864"/>
+                <w:sz w:val="21"/>
+                <w:szCs w:val="21"/>
+                <w:rtl w:val="0"/>
+              </w:rPr>
+              <w:t xml:space="preserve">Pantalla de inicio de sesión del dashboard móvil de NeuroFlex VR, desarrollada para el acceso y gestión de la información generada por los usuarios de la plataforma.</w:t>
+            </w:r>
+          </w:p>
+          <w:p>
+            <w:pPr>
+              <w:rPr>
+                <w:color w:val="1f3864"/>
+              </w:rPr>
+            </w:pPr>
+            <w:r>
+              <w:rPr>
+                <w:rtl w:val="0"/>
+              </w:rPr>
+            </w:r>
+          </w:p>
+        </w:tc>
+        <w:tc>
+          <w:tcPr>
+            <w:vAlign w:val="center"/>
+          </w:tcPr>
+          <w:p>
+            <w:pPr>
+              <w:jc w:val="both"/>
+              <w:rPr>
+                <w:color w:val="548dd4"/>
+                <w:sz w:val="20"/>
+                <w:szCs w:val="20"/>
+              </w:rPr>
+            </w:pPr>
+            <w:r>
+              <w:rPr>
                 <w:color w:val="548dd4"/>
                 <w:sz w:val="20"/>
                 <w:szCs w:val="20"/>
@@ -883,12 +1035,12 @@
                 <wp:inline distB="114300" distT="114300" distL="114300" distR="114300">
                   <wp:extent cx="3752850" cy="8124825"/>
                   <wp:effectExtent b="0" l="0" r="0" t="0"/>
-                  <wp:docPr id="30" name="image5.jpg"/>
+                  <wp:docPr id="36" name="image2.jpg"/>
                   <a:graphic>
                     <a:graphicData uri="http://schemas.openxmlformats.org/drawingml/2006/picture">
                       <pic:pic>
                         <pic:nvPicPr>
-                          <pic:cNvPr id="0" name="image5.jpg"/>
+                          <pic:cNvPr id="0" name="image2.jpg"/>
                           <pic:cNvPicPr preferRelativeResize="0"/>
                         </pic:nvPicPr>
                         <pic:blipFill>
@@ -918,6 +1070,54 @@
               </w:rPr>
             </w:r>
           </w:p>
+        </w:tc>
+      </w:tr>
+      <w:tr>
+        <w:trPr>
+          <w:cantSplit w:val="0"/>
+          <w:trHeight w:val="2377" w:hRule="atLeast"/>
+          <w:tblHeader w:val="0"/>
+        </w:trPr>
+        <w:tc>
+          <w:tcPr>
+            <w:vAlign w:val="center"/>
+          </w:tcPr>
+          <w:p>
+            <w:pPr>
+              <w:spacing w:line="342.85714285714283" w:lineRule="auto"/>
+              <w:rPr>
+                <w:color w:val="1f3864"/>
+                <w:sz w:val="21"/>
+                <w:szCs w:val="21"/>
+              </w:rPr>
+            </w:pPr>
+            <w:r>
+              <w:rPr>
+                <w:color w:val="1f3864"/>
+                <w:sz w:val="21"/>
+                <w:szCs w:val="21"/>
+                <w:rtl w:val="0"/>
+              </w:rPr>
+              <w:t xml:space="preserve">Vista del módulo de sesiones VR dentro del dashboard móvil, mostrando el registro y monitoreo de actividades realizadas por los usuarios, incluyendo métricas básicas de desempeño y estado de sincronización.</w:t>
+            </w:r>
+          </w:p>
+          <w:p>
+            <w:pPr>
+              <w:rPr>
+                <w:color w:val="1f3864"/>
+              </w:rPr>
+            </w:pPr>
+            <w:r>
+              <w:rPr>
+                <w:rtl w:val="0"/>
+              </w:rPr>
+            </w:r>
+          </w:p>
+        </w:tc>
+        <w:tc>
+          <w:tcPr>
+            <w:vAlign w:val="center"/>
+          </w:tcPr>
           <w:p>
             <w:pPr>
               <w:jc w:val="both"/>
@@ -937,12 +1137,12 @@
                 <wp:inline distB="114300" distT="114300" distL="114300" distR="114300">
                   <wp:extent cx="3743325" cy="8058150"/>
                   <wp:effectExtent b="0" l="0" r="0" t="0"/>
-                  <wp:docPr id="33" name="image4.jpg"/>
+                  <wp:docPr id="41" name="image7.jpg"/>
                   <a:graphic>
                     <a:graphicData uri="http://schemas.openxmlformats.org/drawingml/2006/picture">
                       <pic:pic>
                         <pic:nvPicPr>
-                          <pic:cNvPr id="0" name="image4.jpg"/>
+                          <pic:cNvPr id="0" name="image7.jpg"/>
                           <pic:cNvPicPr preferRelativeResize="0"/>
                         </pic:nvPicPr>
                         <pic:blipFill>
@@ -972,6 +1172,54 @@
               </w:rPr>
             </w:r>
           </w:p>
+        </w:tc>
+      </w:tr>
+      <w:tr>
+        <w:trPr>
+          <w:cantSplit w:val="0"/>
+          <w:trHeight w:val="2377" w:hRule="atLeast"/>
+          <w:tblHeader w:val="0"/>
+        </w:trPr>
+        <w:tc>
+          <w:tcPr>
+            <w:vAlign w:val="center"/>
+          </w:tcPr>
+          <w:p>
+            <w:pPr>
+              <w:spacing w:line="342.85714285714283" w:lineRule="auto"/>
+              <w:rPr>
+                <w:color w:val="1f3864"/>
+                <w:sz w:val="21"/>
+                <w:szCs w:val="21"/>
+              </w:rPr>
+            </w:pPr>
+            <w:r>
+              <w:rPr>
+                <w:color w:val="1f3864"/>
+                <w:sz w:val="21"/>
+                <w:szCs w:val="21"/>
+                <w:rtl w:val="0"/>
+              </w:rPr>
+              <w:t xml:space="preserve">Prueba funcional del rompecabezas interactivo en realidad virtual, mostrando la manipulación y posicionamiento de piezas dentro del escenario desarrollado en Unity.</w:t>
+            </w:r>
+          </w:p>
+          <w:p>
+            <w:pPr>
+              <w:rPr>
+                <w:color w:val="1f3864"/>
+              </w:rPr>
+            </w:pPr>
+            <w:r>
+              <w:rPr>
+                <w:rtl w:val="0"/>
+              </w:rPr>
+            </w:r>
+          </w:p>
+        </w:tc>
+        <w:tc>
+          <w:tcPr>
+            <w:vAlign w:val="center"/>
+          </w:tcPr>
           <w:p>
             <w:pPr>
               <w:jc w:val="both"/>
@@ -981,6 +1229,147 @@
                 <w:szCs w:val="20"/>
               </w:rPr>
             </w:pPr>
+            <w:r>
+              <w:rPr>
+                <w:color w:val="548dd4"/>
+                <w:sz w:val="20"/>
+                <w:szCs w:val="20"/>
+              </w:rPr>
+              <w:drawing>
+                <wp:inline distB="114300" distT="114300" distL="114300" distR="114300">
+                  <wp:extent cx="4514850" cy="2540000"/>
+                  <wp:effectExtent b="0" l="0" r="0" t="0"/>
+                  <wp:docPr id="35" name="image6.png"/>
+                  <a:graphic>
+                    <a:graphicData uri="http://schemas.openxmlformats.org/drawingml/2006/picture">
+                      <pic:pic>
+                        <pic:nvPicPr>
+                          <pic:cNvPr id="0" name="image6.png"/>
+                          <pic:cNvPicPr preferRelativeResize="0"/>
+                        </pic:nvPicPr>
+                        <pic:blipFill>
+                          <a:blip r:embed="rId13"/>
+                          <a:srcRect b="0" l="0" r="0" t="0"/>
+                          <a:stretch>
+                            <a:fillRect/>
+                          </a:stretch>
+                        </pic:blipFill>
+                        <pic:spPr>
+                          <a:xfrm>
+                            <a:off x="0" y="0"/>
+                            <a:ext cx="4514850" cy="2540000"/>
+                          </a:xfrm>
+                          <a:prstGeom prst="rect"/>
+                          <a:ln/>
+                        </pic:spPr>
+                      </pic:pic>
+                    </a:graphicData>
+                  </a:graphic>
+                </wp:inline>
+              </w:drawing>
+            </w:r>
+            <w:r>
+              <w:rPr>
+                <w:rtl w:val="0"/>
+              </w:rPr>
+            </w:r>
+          </w:p>
+        </w:tc>
+      </w:tr>
+      <w:tr>
+        <w:trPr>
+          <w:cantSplit w:val="0"/>
+          <w:trHeight w:val="2377" w:hRule="atLeast"/>
+          <w:tblHeader w:val="0"/>
+        </w:trPr>
+        <w:tc>
+          <w:tcPr>
+            <w:vAlign w:val="center"/>
+          </w:tcPr>
+          <w:p>
+            <w:pPr>
+              <w:spacing w:line="342.85714285714283" w:lineRule="auto"/>
+              <w:rPr>
+                <w:color w:val="1f3864"/>
+                <w:sz w:val="21"/>
+                <w:szCs w:val="21"/>
+              </w:rPr>
+            </w:pPr>
+            <w:r>
+              <w:rPr>
+                <w:color w:val="1f3864"/>
+                <w:sz w:val="21"/>
+                <w:szCs w:val="21"/>
+                <w:rtl w:val="0"/>
+              </w:rPr>
+              <w:t xml:space="preserve">Vista del editor de Unity donde se observa la integración del rompecabezas y los elementos del entorno de la librería, evidenciando el avance en la construcción del escenario 3D.</w:t>
+            </w:r>
+          </w:p>
+          <w:p>
+            <w:pPr>
+              <w:rPr>
+                <w:color w:val="1f3864"/>
+              </w:rPr>
+            </w:pPr>
+            <w:r>
+              <w:rPr>
+                <w:rtl w:val="0"/>
+              </w:rPr>
+            </w:r>
+          </w:p>
+        </w:tc>
+        <w:tc>
+          <w:tcPr>
+            <w:vAlign w:val="center"/>
+          </w:tcPr>
+          <w:p>
+            <w:pPr>
+              <w:jc w:val="both"/>
+              <w:rPr>
+                <w:color w:val="548dd4"/>
+                <w:sz w:val="20"/>
+                <w:szCs w:val="20"/>
+              </w:rPr>
+            </w:pPr>
+            <w:r>
+              <w:rPr>
+                <w:color w:val="548dd4"/>
+                <w:sz w:val="20"/>
+                <w:szCs w:val="20"/>
+              </w:rPr>
+              <w:drawing>
+                <wp:inline distB="114300" distT="114300" distL="114300" distR="114300">
+                  <wp:extent cx="4514850" cy="2425700"/>
+                  <wp:effectExtent b="0" l="0" r="0" t="0"/>
+                  <wp:docPr id="40" name="image5.png"/>
+                  <a:graphic>
+                    <a:graphicData uri="http://schemas.openxmlformats.org/drawingml/2006/picture">
+                      <pic:pic>
+                        <pic:nvPicPr>
+                          <pic:cNvPr id="0" name="image5.png"/>
+                          <pic:cNvPicPr preferRelativeResize="0"/>
+                        </pic:nvPicPr>
+                        <pic:blipFill>
+                          <a:blip r:embed="rId14"/>
+                          <a:srcRect b="0" l="0" r="0" t="0"/>
+                          <a:stretch>
+                            <a:fillRect/>
+                          </a:stretch>
+                        </pic:blipFill>
+                        <pic:spPr>
+                          <a:xfrm>
+                            <a:off x="0" y="0"/>
+                            <a:ext cx="4514850" cy="2425700"/>
+                          </a:xfrm>
+                          <a:prstGeom prst="rect"/>
+                          <a:ln/>
+                        </pic:spPr>
+                      </pic:pic>
+                    </a:graphicData>
+                  </a:graphic>
+                </wp:inline>
+              </w:drawing>
+            </w:r>
             <w:r>
               <w:rPr>
                 <w:rtl w:val="0"/>
@@ -1019,6 +1408,34 @@
                 <w:rtl w:val="0"/>
               </w:rPr>
               <w:t xml:space="preserve">2. Monitoreo del Plan de Trabajo </w:t>
+            </w:r>
+          </w:p>
+        </w:tc>
+      </w:tr>
+      <w:tr>
+        <w:trPr>
+          <w:cantSplit w:val="0"/>
+          <w:trHeight w:val="440" w:hRule="atLeast"/>
+          <w:tblHeader w:val="0"/>
+        </w:trPr>
+        <w:tc>
+          <w:tcPr>
+            <w:vAlign w:val="center"/>
+          </w:tcPr>
+          <w:p>
+            <w:pPr>
+              <w:rPr>
+                <w:b w:val="1"/>
+                <w:bCs w:val="1"/>
+                <w:color w:val="1f3864"/>
+                <w:sz w:val="28"/>
+                <w:szCs w:val="28"/>
+              </w:rPr>
+            </w:pPr>
+            <w:r>
+              <w:rPr>
+                <w:rtl w:val="0"/>
+              </w:rPr>
             </w:r>
           </w:p>
         </w:tc>
@@ -1964,7 +2381,7 @@
                 <w:szCs w:val="18"/>
                 <w:rtl w:val="0"/>
               </w:rPr>
-              <w:t xml:space="preserve">Ninguno</w:t>
+              <w:t xml:space="preserve">Desarrollo paralelo ajustado </w:t>
             </w:r>
           </w:p>
         </w:tc>
@@ -2424,7 +2841,6 @@
             <w:pPr>
               <w:keepNext w:val="0"/>
               <w:keepLines w:val="0"/>
-              <w:pageBreakBefore w:val="0"/>
               <w:widowControl w:val="1"/>
               <w:pBdr>
                 <w:top w:space="0" w:sz="0" w:val="nil"/>
@@ -2829,24 +3245,6 @@
               </w:rPr>
             </w:r>
           </w:p>
-          <w:p>
-            <w:pPr>
-              <w:jc w:val="both"/>
-              <w:rPr>
-                <w:rFonts w:ascii="Calibri" w:cs="Calibri" w:eastAsia="Calibri" w:hAnsi="Calibri"/>
-                <w:i w:val="1"/>
-                <w:iCs w:val="1"/>
-                <w:color w:val="548dd4"/>
-                <w:sz w:val="20"/>
-                <w:szCs w:val="20"/>
-              </w:rPr>
-            </w:pPr>
-            <w:r>
-              <w:rPr>
-                <w:rtl w:val="0"/>
-              </w:rPr>
-            </w:r>
-          </w:p>
         </w:tc>
       </w:tr>
     </w:tbl>
@@ -2860,8 +3258,106 @@
         </w:rPr>
       </w:r>
     </w:p>
+    <w:p>
+      <w:pPr>
+        <w:pStyle w:val="Subtitle"/>
+        <w:rPr>
+          <w:sz w:val="34"/>
+          <w:szCs w:val="34"/>
+        </w:rPr>
+      </w:pPr>
+      <w:bookmarkStart w:colFirst="0" w:colLast="0" w:name="_heading=h.gk49ol5ktwa3" w:id="1"/>
+      <w:bookmarkEnd w:id="1"/>
+      <w:r>
+        <w:rPr>
+          <w:sz w:val="34"/>
+          <w:szCs w:val="34"/>
+          <w:rtl w:val="0"/>
+        </w:rPr>
+        <w:t xml:space="preserve">Referencias</w:t>
+      </w:r>
+    </w:p>
+    <w:p>
+      <w:pPr>
+        <w:rPr/>
+      </w:pPr>
+      <w:r>
+        <w:rPr>
+          <w:rtl w:val="0"/>
+        </w:rPr>
+      </w:r>
+    </w:p>
+    <w:p>
+      <w:pPr>
+        <w:rPr/>
+      </w:pPr>
+      <w:r>
+        <w:rPr>
+          <w:rtl w:val="0"/>
+        </w:rPr>
+        <w:t xml:space="preserve">[1] K. Schwaber y J. Sutherland, La Guía de Scrum: Las reglas del juego, Scrum.org, 2020.</w:t>
+      </w:r>
+    </w:p>
+    <w:p>
+      <w:pPr>
+        <w:rPr/>
+      </w:pPr>
+      <w:r>
+        <w:rPr>
+          <w:rtl w:val="0"/>
+        </w:rPr>
+        <w:t xml:space="preserve">[2] Meta Platforms, Unity Integration Documentation &amp; Oculus Quest SDK, 2026. [En línea]. Disponible: https://developer.oculus.com/</w:t>
+      </w:r>
+    </w:p>
+    <w:p>
+      <w:pPr>
+        <w:rPr/>
+      </w:pPr>
+      <w:r>
+        <w:rPr>
+          <w:rtl w:val="0"/>
+        </w:rPr>
+        <w:t xml:space="preserve">[3] Facebook, React Documentation: A JavaScript library for building user interfaces, 2026. [En línea]. Disponible: https://react.dev/</w:t>
+      </w:r>
+    </w:p>
+    <w:p>
+      <w:pPr>
+        <w:rPr/>
+      </w:pPr>
+      <w:r>
+        <w:rPr>
+          <w:rtl w:val="0"/>
+        </w:rPr>
+        <w:t xml:space="preserve">[4] Amazon Web Services (AWS), Architecting for the Cloud: AWS Best Practices, AWS Whitepapers, 2026.</w:t>
+      </w:r>
+      <w:r>
+        <w:rPr>
+          <w:rtl w:val="0"/>
+        </w:rPr>
+      </w:r>
+    </w:p>
+    <w:p>
+      <w:pPr>
+        <w:rPr/>
+      </w:pPr>
+      <w:r>
+        <w:rPr>
+          <w:rtl w:val="0"/>
+        </w:rPr>
+      </w:r>
+    </w:p>
+    <w:p>
+      <w:pPr>
+        <w:rPr/>
+      </w:pPr>
+      <w:r>
+        <w:rPr>
+          <w:rtl w:val="0"/>
+        </w:rPr>
+      </w:r>
+    </w:p>
     <w:sectPr>
-      <w:headerReference r:id="rId13" w:type="default"/>
+      <w:headerReference r:id="rId15" w:type="default"/>
       <w:pgSz w:h="16838" w:w="11906" w:orient="portrait"/>
       <w:pgMar w:bottom="1417" w:top="1417" w:left="1701" w:right="1701" w:header="708" w:footer="708"/>
       <w:pgNumType w:start="1"/>
@@ -2877,7 +3373,6 @@
       <w:pPr>
         <w:keepNext w:val="0"/>
         <w:keepLines w:val="0"/>
-        <w:pageBreakBefore w:val="0"/>
         <w:widowControl w:val="1"/>
         <w:pBdr>
           <w:top w:space="0" w:sz="0" w:val="nil"/>
@@ -2943,7 +3438,6 @@
     <w:pPr>
       <w:keepNext w:val="0"/>
       <w:keepLines w:val="0"/>
-      <w:pageBreakBefore w:val="0"/>
       <w:widowControl w:val="0"/>
       <w:pBdr>
         <w:top w:space="0" w:sz="0" w:val="nil"/>
@@ -3097,7 +3591,7 @@
               <wp:inline distB="0" distT="0" distL="0" distR="0">
                 <wp:extent cx="1996440" cy="428625"/>
                 <wp:effectExtent b="0" l="0" r="0" t="0"/>
-                <wp:docPr descr="http://www.duoc.cl/normasgraficas/normasgraficas/marca-duoc/6logo-fondo-transparente/fondo-transparente.png" id="31" name="image1.png"/>
+                <wp:docPr descr="http://www.duoc.cl/normasgraficas/normasgraficas/marca-duoc/6logo-fondo-transparente/fondo-transparente.png" id="39" name="image1.png"/>
                 <a:graphic>
                   <a:graphicData uri="http://schemas.openxmlformats.org/drawingml/2006/picture">
                     <pic:pic>
@@ -3139,7 +3633,6 @@
     <w:pPr>
       <w:keepNext w:val="0"/>
       <w:keepLines w:val="0"/>
-      <w:pageBreakBefore w:val="0"/>
       <w:widowControl w:val="1"/>
       <w:pBdr>
         <w:top w:space="0" w:sz="0" w:val="nil"/>
@@ -3333,6 +3826,20 @@
       <w:sz w:val="72"/>
       <w:szCs w:val="72"/>
     </w:rPr>
+  </w:style>
+  <w:style w:type="table" w:styleId="TableNormal" w:default="1">
+    <w:name w:val="TableNormal"/>
+    <w:tblPr>
+      <w:tblCellMar>
+        <w:top w:w="100.0" w:type="dxa"/>
+        <w:left w:w="100.0" w:type="dxa"/>
+        <w:bottom w:w="100.0" w:type="dxa"/>
+        <w:right w:w="100.0" w:type="dxa"/>
+      </w:tblCellMar>
+    </w:tblPr>
+  </w:style>
+  <w:style w:type="paragraph" w:styleId="Normal" w:default="1">
+    <w:name w:val="normal"/>
   </w:style>
   <w:style w:type="character" w:styleId="Fuentedeprrafopredeter" w:default="1">
     <w:name w:val="Default Paragraph Font"/>
@@ -3601,6 +4108,142 @@
       <w:sz w:val="20"/>
       <w:szCs w:val="20"/>
     </w:rPr>
+  </w:style>
+  <w:style w:type="table" w:styleId="Table1">
+    <w:basedOn w:val="TableNormal"/>
+    <w:rPr>
+      <w:sz w:val="22"/>
+      <w:szCs w:val="22"/>
+    </w:rPr>
+    <w:tblPr>
+      <w:tblStyleRowBandSize w:val="1"/>
+      <w:tblStyleColBandSize w:val="1"/>
+      <w:tblCellMar>
+        <w:top w:w="0.0" w:type="dxa"/>
+        <w:left w:w="108.0" w:type="dxa"/>
+        <w:bottom w:w="0.0" w:type="dxa"/>
+        <w:right w:w="108.0" w:type="dxa"/>
+      </w:tblCellMar>
+    </w:tblPr>
+  </w:style>
+  <w:style w:type="table" w:styleId="Table2">
+    <w:basedOn w:val="TableNormal"/>
+    <w:rPr>
+      <w:sz w:val="22"/>
+      <w:szCs w:val="22"/>
+    </w:rPr>
+    <w:tblPr>
+      <w:tblStyleRowBandSize w:val="1"/>
+      <w:tblStyleColBandSize w:val="1"/>
+      <w:tblCellMar>
+        <w:top w:w="0.0" w:type="dxa"/>
+        <w:left w:w="108.0" w:type="dxa"/>
+        <w:bottom w:w="0.0" w:type="dxa"/>
+        <w:right w:w="108.0" w:type="dxa"/>
+      </w:tblCellMar>
+    </w:tblPr>
+  </w:style>
+  <w:style w:type="table" w:styleId="Table3">
+    <w:basedOn w:val="TableNormal"/>
+    <w:rPr>
+      <w:sz w:val="22"/>
+      <w:szCs w:val="22"/>
+    </w:rPr>
+    <w:tblPr>
+      <w:tblStyleRowBandSize w:val="1"/>
+      <w:tblStyleColBandSize w:val="1"/>
+      <w:tblCellMar>
+        <w:top w:w="0.0" w:type="dxa"/>
+        <w:left w:w="108.0" w:type="dxa"/>
+        <w:bottom w:w="0.0" w:type="dxa"/>
+        <w:right w:w="108.0" w:type="dxa"/>
+      </w:tblCellMar>
+    </w:tblPr>
+  </w:style>
+  <w:style w:type="table" w:styleId="Table4">
+    <w:basedOn w:val="TableNormal"/>
+    <w:rPr>
+      <w:sz w:val="22"/>
+      <w:szCs w:val="22"/>
+    </w:rPr>
+    <w:tblPr>
+      <w:tblStyleRowBandSize w:val="1"/>
+      <w:tblStyleColBandSize w:val="1"/>
+      <w:tblCellMar>
+        <w:top w:w="0.0" w:type="dxa"/>
+        <w:left w:w="108.0" w:type="dxa"/>
+        <w:bottom w:w="0.0" w:type="dxa"/>
+        <w:right w:w="108.0" w:type="dxa"/>
+      </w:tblCellMar>
+    </w:tblPr>
+  </w:style>
+  <w:style w:type="table" w:styleId="Table5">
+    <w:basedOn w:val="TableNormal"/>
+    <w:rPr>
+      <w:sz w:val="22"/>
+      <w:szCs w:val="22"/>
+    </w:rPr>
+    <w:tblPr>
+      <w:tblStyleRowBandSize w:val="1"/>
+      <w:tblStyleColBandSize w:val="1"/>
+      <w:tblCellMar>
+        <w:top w:w="0.0" w:type="dxa"/>
+        <w:left w:w="108.0" w:type="dxa"/>
+        <w:bottom w:w="0.0" w:type="dxa"/>
+        <w:right w:w="108.0" w:type="dxa"/>
+      </w:tblCellMar>
+    </w:tblPr>
+  </w:style>
+  <w:style w:type="table" w:styleId="Table6">
+    <w:basedOn w:val="TableNormal"/>
+    <w:rPr>
+      <w:sz w:val="22"/>
+      <w:szCs w:val="22"/>
+    </w:rPr>
+    <w:tblPr>
+      <w:tblStyleRowBandSize w:val="1"/>
+      <w:tblStyleColBandSize w:val="1"/>
+      <w:tblCellMar>
+        <w:top w:w="0.0" w:type="dxa"/>
+        <w:left w:w="108.0" w:type="dxa"/>
+        <w:bottom w:w="0.0" w:type="dxa"/>
+        <w:right w:w="108.0" w:type="dxa"/>
+      </w:tblCellMar>
+    </w:tblPr>
+  </w:style>
+  <w:style w:type="table" w:styleId="Table7">
+    <w:basedOn w:val="TableNormal"/>
+    <w:rPr>
+      <w:sz w:val="22"/>
+      <w:szCs w:val="22"/>
+    </w:rPr>
+    <w:tblPr>
+      <w:tblStyleRowBandSize w:val="1"/>
+      <w:tblStyleColBandSize w:val="1"/>
+      <w:tblCellMar>
+        <w:top w:w="0.0" w:type="dxa"/>
+        <w:left w:w="108.0" w:type="dxa"/>
+        <w:bottom w:w="0.0" w:type="dxa"/>
+        <w:right w:w="108.0" w:type="dxa"/>
+      </w:tblCellMar>
+    </w:tblPr>
+  </w:style>
+  <w:style w:type="table" w:styleId="Table8">
+    <w:basedOn w:val="TableNormal"/>
+    <w:rPr>
+      <w:sz w:val="22"/>
+      <w:szCs w:val="22"/>
+    </w:rPr>
+    <w:tblPr>
+      <w:tblStyleRowBandSize w:val="1"/>
+      <w:tblStyleColBandSize w:val="1"/>
+      <w:tblCellMar>
+        <w:top w:w="0.0" w:type="dxa"/>
+        <w:left w:w="108.0" w:type="dxa"/>
+        <w:bottom w:w="0.0" w:type="dxa"/>
+        <w:right w:w="108.0" w:type="dxa"/>
+      </w:tblCellMar>
+    </w:tblPr>
   </w:style>
   <w:style w:type="paragraph" w:styleId="Subtitle">
     <w:name w:val="Subtitle"/>
@@ -4057,7 +4700,7 @@
 
 <file path=customXML/item1.xml><?xml version="1.0" encoding="utf-8"?>
 <go:gDocsCustomXmlDataStorage xmlns:go="http://customooxmlschemas.google.com/" xmlns:r="http://schemas.openxmlformats.org/officeDocument/2006/relationships" uri="GoogleDocsCustomDataVersion2">
-  <go:docsCustomData xmlns:go="http://customooxmlschemas.google.com/" roundtripDataSignature="AMtx7mhasyybWIBRXK8Xpp3mpwIRpNL9xg==">CgMxLjAyDmgucmN3OTBldDBxOHRqOAByITFyaG0xUk5xUGlOZlQ1SHdFQTVNU2tRZjQ1OVNFU2pfbg==</go:docsCustomData>
+  <go:docsCustomData xmlns:go="http://customooxmlschemas.google.com/" roundtripDataSignature="AMtx7mgavp0IuKzkZqMKvN0m0Rr7uUUZTw==">CgMxLjAyDmgucmN3OTBldDBxOHRqMg5oLmdrNDlvbDVrdHdhMzgAciExeUl0VGNUQVNvYms0WUtaejJKdjJwZGtzMEE2cEh3S1E=</go:docsCustomData>
 </go:gDocsCustomXmlDataStorage>
 </file>
 

</xml_diff>

<commit_message>
Se mejoro el escenario del juego de memoria
</commit_message>
<xml_diff>
--- a/Documentación Capstone/Fase 2/Evidencias Grupales/2.4_GuiaEstudiante_Fase 2_DesarrolloProyecto APT.docx
+++ b/Documentación Capstone/Fase 2/Evidencias Grupales/2.4_GuiaEstudiante_Fase 2_DesarrolloProyecto APT.docx
@@ -291,12 +291,12 @@
                 <wp:extent cx="6238875" cy="1562100"/>
                 <wp:effectExtent b="0" l="0" r="0" t="0"/>
                 <wp:wrapNone/>
-                <wp:docPr id="34" name="image8.png"/>
+                <wp:docPr id="34" name="image10.png"/>
                 <a:graphic>
                   <a:graphicData uri="http://schemas.openxmlformats.org/drawingml/2006/picture">
                     <pic:pic>
                       <pic:nvPicPr>
-                        <pic:cNvPr id="0" name="image8.png"/>
+                        <pic:cNvPr id="0" name="image10.png"/>
                         <pic:cNvPicPr preferRelativeResize="0"/>
                       </pic:nvPicPr>
                       <pic:blipFill>
@@ -746,7 +746,7 @@
       <w:tr>
         <w:trPr>
           <w:cantSplit w:val="0"/>
-          <w:trHeight w:val="939" w:hRule="atLeast"/>
+          <w:trHeight w:val="6919.327799479168" w:hRule="atLeast"/>
           <w:tblHeader w:val="0"/>
         </w:trPr>
         <w:tc>
@@ -790,7 +790,115 @@
                 <w:szCs w:val="20"/>
                 <w:rtl w:val="0"/>
               </w:rPr>
-              <w:t xml:space="preserve">Metodología Ágil Scrum Master / KANBAN - JIRA </w:t>
+              <w:t xml:space="preserve">Marco de trabajo Ágil (Scrum + Kanban mediante Jira)</w:t>
+            </w:r>
+          </w:p>
+          <w:p>
+            <w:pPr>
+              <w:jc w:val="both"/>
+              <w:rPr>
+                <w:color w:val="548dd4"/>
+                <w:sz w:val="20"/>
+                <w:szCs w:val="20"/>
+              </w:rPr>
+            </w:pPr>
+            <w:r>
+              <w:rPr>
+                <w:color w:val="548dd4"/>
+                <w:sz w:val="20"/>
+                <w:szCs w:val="20"/>
+              </w:rPr>
+              <w:drawing>
+                <wp:inline distB="114300" distT="114300" distL="114300" distR="114300">
+                  <wp:extent cx="4514850" cy="2184400"/>
+                  <wp:effectExtent b="0" l="0" r="0" t="0"/>
+                  <wp:docPr id="42" name="image6.png"/>
+                  <a:graphic>
+                    <a:graphicData uri="http://schemas.openxmlformats.org/drawingml/2006/picture">
+                      <pic:pic>
+                        <pic:nvPicPr>
+                          <pic:cNvPr id="0" name="image6.png"/>
+                          <pic:cNvPicPr preferRelativeResize="0"/>
+                        </pic:nvPicPr>
+                        <pic:blipFill>
+                          <a:blip r:embed="rId9"/>
+                          <a:srcRect b="0" l="0" r="0" t="0"/>
+                          <a:stretch>
+                            <a:fillRect/>
+                          </a:stretch>
+                        </pic:blipFill>
+                        <pic:spPr>
+                          <a:xfrm>
+                            <a:off x="0" y="0"/>
+                            <a:ext cx="4514850" cy="2184400"/>
+                          </a:xfrm>
+                          <a:prstGeom prst="rect"/>
+                          <a:ln/>
+                        </pic:spPr>
+                      </pic:pic>
+                    </a:graphicData>
+                  </a:graphic>
+                </wp:inline>
+              </w:drawing>
+            </w:r>
+            <w:r>
+              <w:rPr>
+                <w:rtl w:val="0"/>
+              </w:rPr>
+            </w:r>
+          </w:p>
+          <w:p>
+            <w:pPr>
+              <w:jc w:val="both"/>
+              <w:rPr>
+                <w:color w:val="548dd4"/>
+                <w:sz w:val="20"/>
+                <w:szCs w:val="20"/>
+              </w:rPr>
+            </w:pPr>
+            <w:r>
+              <w:rPr>
+                <w:color w:val="548dd4"/>
+                <w:sz w:val="20"/>
+                <w:szCs w:val="20"/>
+              </w:rPr>
+              <w:drawing>
+                <wp:inline distB="114300" distT="114300" distL="114300" distR="114300">
+                  <wp:extent cx="4514850" cy="2184400"/>
+                  <wp:effectExtent b="0" l="0" r="0" t="0"/>
+                  <wp:docPr id="36" name="image4.png"/>
+                  <a:graphic>
+                    <a:graphicData uri="http://schemas.openxmlformats.org/drawingml/2006/picture">
+                      <pic:pic>
+                        <pic:nvPicPr>
+                          <pic:cNvPr id="0" name="image4.png"/>
+                          <pic:cNvPicPr preferRelativeResize="0"/>
+                        </pic:nvPicPr>
+                        <pic:blipFill>
+                          <a:blip r:embed="rId10"/>
+                          <a:srcRect b="0" l="0" r="0" t="0"/>
+                          <a:stretch>
+                            <a:fillRect/>
+                          </a:stretch>
+                        </pic:blipFill>
+                        <pic:spPr>
+                          <a:xfrm>
+                            <a:off x="0" y="0"/>
+                            <a:ext cx="4514850" cy="2184400"/>
+                          </a:xfrm>
+                          <a:prstGeom prst="rect"/>
+                          <a:ln/>
+                        </pic:spPr>
+                      </pic:pic>
+                    </a:graphicData>
+                  </a:graphic>
+                </wp:inline>
+              </w:drawing>
+            </w:r>
+            <w:r>
+              <w:rPr>
+                <w:rtl w:val="0"/>
+              </w:rPr>
             </w:r>
           </w:p>
         </w:tc>
@@ -858,7 +966,7 @@
                           <pic:cNvPicPr preferRelativeResize="0"/>
                         </pic:nvPicPr>
                         <pic:blipFill>
-                          <a:blip r:embed="rId9"/>
+                          <a:blip r:embed="rId11"/>
                           <a:srcRect b="0" l="0" r="0" t="0"/>
                           <a:stretch>
                             <a:fillRect/>
@@ -903,16 +1011,16 @@
                 <wp:inline distB="114300" distT="114300" distL="114300" distR="114300">
                   <wp:extent cx="4514850" cy="4229100"/>
                   <wp:effectExtent b="0" l="0" r="0" t="0"/>
-                  <wp:docPr id="38" name="image4.png"/>
+                  <wp:docPr id="38" name="image2.png"/>
                   <a:graphic>
                     <a:graphicData uri="http://schemas.openxmlformats.org/drawingml/2006/picture">
                       <pic:pic>
                         <pic:nvPicPr>
-                          <pic:cNvPr id="0" name="image4.png"/>
+                          <pic:cNvPr id="0" name="image2.png"/>
                           <pic:cNvPicPr preferRelativeResize="0"/>
                         </pic:nvPicPr>
                         <pic:blipFill>
-                          <a:blip r:embed="rId10"/>
+                          <a:blip r:embed="rId12"/>
                           <a:srcRect b="0" l="0" r="0" t="0"/>
                           <a:stretch>
                             <a:fillRect/>
@@ -1035,16 +1143,16 @@
                 <wp:inline distB="114300" distT="114300" distL="114300" distR="114300">
                   <wp:extent cx="3752850" cy="8124825"/>
                   <wp:effectExtent b="0" l="0" r="0" t="0"/>
-                  <wp:docPr id="36" name="image2.jpg"/>
+                  <wp:docPr id="35" name="image1.jpg"/>
                   <a:graphic>
                     <a:graphicData uri="http://schemas.openxmlformats.org/drawingml/2006/picture">
                       <pic:pic>
                         <pic:nvPicPr>
-                          <pic:cNvPr id="0" name="image2.jpg"/>
+                          <pic:cNvPr id="0" name="image1.jpg"/>
                           <pic:cNvPicPr preferRelativeResize="0"/>
                         </pic:nvPicPr>
                         <pic:blipFill>
-                          <a:blip r:embed="rId11"/>
+                          <a:blip r:embed="rId13"/>
                           <a:srcRect b="0" l="0" r="0" t="0"/>
                           <a:stretch>
                             <a:fillRect/>
@@ -1137,16 +1245,16 @@
                 <wp:inline distB="114300" distT="114300" distL="114300" distR="114300">
                   <wp:extent cx="3743325" cy="8058150"/>
                   <wp:effectExtent b="0" l="0" r="0" t="0"/>
-                  <wp:docPr id="41" name="image7.jpg"/>
+                  <wp:docPr id="43" name="image5.jpg"/>
                   <a:graphic>
                     <a:graphicData uri="http://schemas.openxmlformats.org/drawingml/2006/picture">
                       <pic:pic>
                         <pic:nvPicPr>
-                          <pic:cNvPr id="0" name="image7.jpg"/>
+                          <pic:cNvPr id="0" name="image5.jpg"/>
                           <pic:cNvPicPr preferRelativeResize="0"/>
                         </pic:nvPicPr>
                         <pic:blipFill>
-                          <a:blip r:embed="rId12"/>
+                          <a:blip r:embed="rId14"/>
                           <a:srcRect b="0" l="0" r="0" t="0"/>
                           <a:stretch>
                             <a:fillRect/>
@@ -1239,16 +1347,16 @@
                 <wp:inline distB="114300" distT="114300" distL="114300" distR="114300">
                   <wp:extent cx="4514850" cy="2540000"/>
                   <wp:effectExtent b="0" l="0" r="0" t="0"/>
-                  <wp:docPr id="35" name="image6.png"/>
+                  <wp:docPr id="41" name="image8.png"/>
                   <a:graphic>
                     <a:graphicData uri="http://schemas.openxmlformats.org/drawingml/2006/picture">
                       <pic:pic>
                         <pic:nvPicPr>
-                          <pic:cNvPr id="0" name="image6.png"/>
+                          <pic:cNvPr id="0" name="image8.png"/>
                           <pic:cNvPicPr preferRelativeResize="0"/>
                         </pic:nvPicPr>
                         <pic:blipFill>
-                          <a:blip r:embed="rId13"/>
+                          <a:blip r:embed="rId15"/>
                           <a:srcRect b="0" l="0" r="0" t="0"/>
                           <a:stretch>
                             <a:fillRect/>
@@ -1341,16 +1449,16 @@
                 <wp:inline distB="114300" distT="114300" distL="114300" distR="114300">
                   <wp:extent cx="4514850" cy="2425700"/>
                   <wp:effectExtent b="0" l="0" r="0" t="0"/>
-                  <wp:docPr id="40" name="image5.png"/>
+                  <wp:docPr id="40" name="image7.png"/>
                   <a:graphic>
                     <a:graphicData uri="http://schemas.openxmlformats.org/drawingml/2006/picture">
                       <pic:pic>
                         <pic:nvPicPr>
-                          <pic:cNvPr id="0" name="image5.png"/>
+                          <pic:cNvPr id="0" name="image7.png"/>
                           <pic:cNvPicPr preferRelativeResize="0"/>
                         </pic:nvPicPr>
                         <pic:blipFill>
-                          <a:blip r:embed="rId14"/>
+                          <a:blip r:embed="rId16"/>
                           <a:srcRect b="0" l="0" r="0" t="0"/>
                           <a:stretch>
                             <a:fillRect/>
@@ -2962,7 +3070,7 @@
                 <w:color w:val="1f3864"/>
                 <w:rtl w:val="0"/>
               </w:rPr>
-              <w:t xml:space="preserve">Un factor facilitador importante fue programar el prototipo del dashboard directamente en React, permitiendo evaluar la usabilidad anticipadamente. La principal dificultad ha sido la dependencia de datos, como en el entrenamiento de la IA local ya que requiere datos precisos, pero la telemetría en RV aún no ha iniciado. Para solucionar ésto, generamos mock data que nos permitirá entregar la IA sin frenar el desarrollo del entorno virtual.</w:t>
+              <w:t xml:space="preserve">Un factor facilitador importante fue programar el prototipo del dashboard directamente en React, permitiendo evaluar la usabilidad anticipadamente. La principal dificultad ha sido la dependencia de datos, como en el entrenamiento de la IA local ya que requiere datos precisos, pero la telemetría en RV aún no ha iniciado. Para solucionar esto, generamos mock data que nos permitirá entregar la IA sin frenar el desarrollo del entorno virtual.</w:t>
               <w:br w:type="textWrapping"/>
             </w:r>
             <w:r>
@@ -3219,7 +3327,21 @@
                 <w:color w:val="1f3864"/>
                 <w:rtl w:val="0"/>
               </w:rPr>
-              <w:t xml:space="preserve">La actividad de Diseño de arquitectura Cloud en AWS se encuentra no iniciada intencionalmente, el motivo de ésto es que la estructura del JSON para la telemetría que emitirá la Realidad Virtual aún está sujeta a modificaciones. La idea es congelar la estructura de telemetría en el próximo Sprint para empezar el desarrollo en AWS y diseñar las bases de datos.</w:t>
+              <w:t xml:space="preserve">La actividad de Diseño de arquitectura Cloud en AWS se encuentra no iniciada intencionalmente; el motivo de esto es que la estructura del JSON para la telemetría que emitirá la Realidad Virtual aún está sujeta a modificaciones. Para estructurar correctamente este almacenamiento, la telemetría final </w:t>
+            </w:r>
+            <w:r>
+              <w:rPr>
+                <w:color w:val="1f3864"/>
+                <w:rtl w:val="0"/>
+              </w:rPr>
+              <w:t xml:space="preserve">recopilará</w:t>
+            </w:r>
+            <w:r>
+              <w:rPr>
+                <w:color w:val="1f3864"/>
+                <w:rtl w:val="0"/>
+              </w:rPr>
+              <w:t xml:space="preserve"> tres bloques de datos: 1) Métricas de desempeño clínico (porcentaje de precisión y tiempos de respuesta), y 2) Metadatos de la sesión (ID del paciente, versión del escenario y duración total). La idea es congelar esta estructura de telemetría en el próximo Sprint para empezar formalmente el desarrollo en AWS y diseñar las bases de datos definitivas.</w:t>
             </w:r>
             <w:r>
               <w:rPr>
@@ -3289,47 +3411,31 @@
     </w:p>
     <w:p>
       <w:pPr>
-        <w:rPr/>
+        <w:numPr>
+          <w:ilvl w:val="0"/>
+          <w:numId w:val="1"/>
+        </w:numPr>
+        <w:ind w:left="720" w:hanging="360"/>
+        <w:rPr>
+          <w:u w:val="none"/>
+        </w:rPr>
       </w:pPr>
       <w:r>
         <w:rPr>
           <w:rtl w:val="0"/>
         </w:rPr>
-        <w:t xml:space="preserve">[1] K. Schwaber y J. Sutherland, La Guía de Scrum: Las reglas del juego, Scrum.org, 2020.</w:t>
+        <w:t xml:space="preserve">Amazon Web Services. (2026). Architecting for the cloud: AWS best practices (AWS Whitepapers). </w:t>
       </w:r>
-    </w:p>
-    <w:p>
-      <w:pPr>
-        <w:rPr/>
-      </w:pPr>
-      <w:r>
-        <w:rPr>
-          <w:rtl w:val="0"/>
-        </w:rPr>
-        <w:t xml:space="preserve">[2] Meta Platforms, Unity Integration Documentation &amp; Oculus Quest SDK, 2026. [En línea]. Disponible: https://developer.oculus.com/</w:t>
-      </w:r>
-    </w:p>
-    <w:p>
-      <w:pPr>
-        <w:rPr/>
-      </w:pPr>
-      <w:r>
-        <w:rPr>
-          <w:rtl w:val="0"/>
-        </w:rPr>
-        <w:t xml:space="preserve">[3] Facebook, React Documentation: A JavaScript library for building user interfaces, 2026. [En línea]. Disponible: https://react.dev/</w:t>
-      </w:r>
-    </w:p>
-    <w:p>
-      <w:pPr>
-        <w:rPr/>
-      </w:pPr>
-      <w:r>
-        <w:rPr>
-          <w:rtl w:val="0"/>
-        </w:rPr>
-        <w:t xml:space="preserve">[4] Amazon Web Services (AWS), Architecting for the Cloud: AWS Best Practices, AWS Whitepapers, 2026.</w:t>
-      </w:r>
+      <w:hyperlink r:id="rId17">
+        <w:r>
+          <w:rPr>
+            <w:color w:val="1155cc"/>
+            <w:u w:val="single"/>
+            <w:rtl w:val="0"/>
+          </w:rPr>
+          <w:t xml:space="preserve">https://aws.amazon.com/whitepapers/</w:t>
+        </w:r>
+      </w:hyperlink>
       <w:r>
         <w:rPr>
           <w:rtl w:val="0"/>
@@ -3338,6 +3444,7 @@
     </w:p>
     <w:p>
       <w:pPr>
+        <w:ind w:left="720" w:firstLine="0"/>
         <w:rPr/>
       </w:pPr>
       <w:r>
@@ -3348,6 +3455,25 @@
     </w:p>
     <w:p>
       <w:pPr>
+        <w:numPr>
+          <w:ilvl w:val="0"/>
+          <w:numId w:val="1"/>
+        </w:numPr>
+        <w:ind w:left="720" w:hanging="360"/>
+        <w:rPr>
+          <w:u w:val="none"/>
+        </w:rPr>
+      </w:pPr>
+      <w:r>
+        <w:rPr>
+          <w:rtl w:val="0"/>
+        </w:rPr>
+        <w:t xml:space="preserve">Facebook. (2026). React documentation: A JavaScript library for building user interfaces. https://react.dev/</w:t>
+      </w:r>
+    </w:p>
+    <w:p>
+      <w:pPr>
+        <w:ind w:left="720" w:firstLine="0"/>
         <w:rPr/>
       </w:pPr>
       <w:r>
@@ -3356,8 +3482,60 @@
         </w:rPr>
       </w:r>
     </w:p>
+    <w:p>
+      <w:pPr>
+        <w:numPr>
+          <w:ilvl w:val="0"/>
+          <w:numId w:val="1"/>
+        </w:numPr>
+        <w:ind w:left="720" w:hanging="360"/>
+        <w:rPr>
+          <w:u w:val="none"/>
+        </w:rPr>
+      </w:pPr>
+      <w:r>
+        <w:rPr>
+          <w:rtl w:val="0"/>
+        </w:rPr>
+        <w:t xml:space="preserve">Meta Platforms. (2026). Unity integration documentation &amp; Oculus Quest SDK. https://developer.oculus.com/</w:t>
+      </w:r>
+    </w:p>
+    <w:p>
+      <w:pPr>
+        <w:ind w:left="720" w:firstLine="0"/>
+        <w:rPr/>
+      </w:pPr>
+      <w:r>
+        <w:rPr>
+          <w:rtl w:val="0"/>
+        </w:rPr>
+      </w:r>
+    </w:p>
+    <w:p>
+      <w:pPr>
+        <w:numPr>
+          <w:ilvl w:val="0"/>
+          <w:numId w:val="1"/>
+        </w:numPr>
+        <w:ind w:left="720" w:hanging="360"/>
+        <w:rPr>
+          <w:u w:val="none"/>
+        </w:rPr>
+      </w:pPr>
+      <w:r>
+        <w:rPr>
+          <w:rtl w:val="0"/>
+        </w:rPr>
+        <w:t xml:space="preserve">Schwaber, K., &amp; Sutherland, J. (2020). La guía de Scrum: Las reglas del juego. Scrum.org. https://scrumguides.org/</w:t>
+      </w:r>
+      <w:r>
+        <w:rPr>
+          <w:rtl w:val="0"/>
+        </w:rPr>
+      </w:r>
+    </w:p>
     <w:sectPr>
-      <w:headerReference r:id="rId15" w:type="default"/>
+      <w:headerReference r:id="rId18" w:type="default"/>
       <w:pgSz w:h="16838" w:w="11906" w:orient="portrait"/>
       <w:pgMar w:bottom="1417" w:top="1417" w:left="1701" w:right="1701" w:header="708" w:footer="708"/>
       <w:pgNumType w:start="1"/>
@@ -3591,12 +3769,12 @@
               <wp:inline distB="0" distT="0" distL="0" distR="0">
                 <wp:extent cx="1996440" cy="428625"/>
                 <wp:effectExtent b="0" l="0" r="0" t="0"/>
-                <wp:docPr descr="http://www.duoc.cl/normasgraficas/normasgraficas/marca-duoc/6logo-fondo-transparente/fondo-transparente.png" id="39" name="image1.png"/>
+                <wp:docPr descr="http://www.duoc.cl/normasgraficas/normasgraficas/marca-duoc/6logo-fondo-transparente/fondo-transparente.png" id="39" name="image9.png"/>
                 <a:graphic>
                   <a:graphicData uri="http://schemas.openxmlformats.org/drawingml/2006/picture">
                     <pic:pic>
                       <pic:nvPicPr>
-                        <pic:cNvPr descr="http://www.duoc.cl/normasgraficas/normasgraficas/marca-duoc/6logo-fondo-transparente/fondo-transparente.png" id="0" name="image1.png"/>
+                        <pic:cNvPr descr="http://www.duoc.cl/normasgraficas/normasgraficas/marca-duoc/6logo-fondo-transparente/fondo-transparente.png" id="0" name="image9.png"/>
                         <pic:cNvPicPr preferRelativeResize="0"/>
                       </pic:nvPicPr>
                       <pic:blipFill>
@@ -3675,7 +3853,121 @@
 </file>
 
 <file path=word/numbering.xml><?xml version="1.0" encoding="utf-8"?>
-<w:numbering xmlns:mc="http://schemas.openxmlformats.org/markup-compatibility/2006" xmlns:o="urn:schemas-microsoft-com:office:office" xmlns:r="http://schemas.openxmlformats.org/officeDocument/2006/relationships" xmlns:m="http://schemas.openxmlformats.org/officeDocument/2006/math" xmlns:v="urn:schemas-microsoft-com:vml" xmlns:wp="http://schemas.openxmlformats.org/drawingml/2006/wordprocessingDrawing" xmlns:w10="urn:schemas-microsoft-com:office:word" xmlns:w="http://schemas.openxmlformats.org/wordprocessingml/2006/main" xmlns:wne="http://schemas.microsoft.com/office/word/2006/wordml" xmlns:sl="http://schemas.openxmlformats.org/schemaLibrary/2006/main" xmlns:a="http://schemas.openxmlformats.org/drawingml/2006/main" xmlns:pic="http://schemas.openxmlformats.org/drawingml/2006/picture" xmlns:c="http://schemas.openxmlformats.org/drawingml/2006/chart" xmlns:lc="http://schemas.openxmlformats.org/drawingml/2006/lockedCanvas" xmlns:dgm="http://schemas.openxmlformats.org/drawingml/2006/diagram" xmlns:wps="http://schemas.microsoft.com/office/word/2010/wordprocessingShape" xmlns:wpg="http://schemas.microsoft.com/office/word/2010/wordprocessingGroup" xmlns:w14="http://schemas.microsoft.com/office/word/2010/wordml" xmlns:w15="http://schemas.microsoft.com/office/word/2012/wordml" xmlns:w16="http://schemas.microsoft.com/office/word/2018/wordml" xmlns:w16cex="http://schemas.microsoft.com/office/word/2018/wordml/cex" xmlns:w16cid="http://schemas.microsoft.com/office/word/2016/wordml/cid" xmlns="http://schemas.microsoft.com/office/tasks/2019/documenttasks" xmlns:cr="http://schemas.microsoft.com/office/comments/2020/reactions"/>
+<w:numbering xmlns:mc="http://schemas.openxmlformats.org/markup-compatibility/2006" xmlns:o="urn:schemas-microsoft-com:office:office" xmlns:r="http://schemas.openxmlformats.org/officeDocument/2006/relationships" xmlns:m="http://schemas.openxmlformats.org/officeDocument/2006/math" xmlns:v="urn:schemas-microsoft-com:vml" xmlns:wp="http://schemas.openxmlformats.org/drawingml/2006/wordprocessingDrawing" xmlns:w10="urn:schemas-microsoft-com:office:word" xmlns:w="http://schemas.openxmlformats.org/wordprocessingml/2006/main" xmlns:wne="http://schemas.microsoft.com/office/word/2006/wordml" xmlns:sl="http://schemas.openxmlformats.org/schemaLibrary/2006/main" xmlns:a="http://schemas.openxmlformats.org/drawingml/2006/main" xmlns:pic="http://schemas.openxmlformats.org/drawingml/2006/picture" xmlns:c="http://schemas.openxmlformats.org/drawingml/2006/chart" xmlns:lc="http://schemas.openxmlformats.org/drawingml/2006/lockedCanvas" xmlns:dgm="http://schemas.openxmlformats.org/drawingml/2006/diagram" xmlns:wps="http://schemas.microsoft.com/office/word/2010/wordprocessingShape" xmlns:wpg="http://schemas.microsoft.com/office/word/2010/wordprocessingGroup" xmlns:w14="http://schemas.microsoft.com/office/word/2010/wordml" xmlns:w15="http://schemas.microsoft.com/office/word/2012/wordml" xmlns:w16="http://schemas.microsoft.com/office/word/2018/wordml" xmlns:w16cex="http://schemas.microsoft.com/office/word/2018/wordml/cex" xmlns:w16cid="http://schemas.microsoft.com/office/word/2016/wordml/cid" xmlns="http://schemas.microsoft.com/office/tasks/2019/documenttasks" xmlns:cr="http://schemas.microsoft.com/office/comments/2020/reactions">
+  <w:abstractNum w:abstractNumId="1">
+    <w:lvl w:ilvl="0">
+      <w:start w:val="1"/>
+      <w:numFmt w:val="decimal"/>
+      <w:lvlText w:val="%1)"/>
+      <w:lvlJc w:val="left"/>
+      <w:pPr>
+        <w:ind w:left="720" w:hanging="360"/>
+      </w:pPr>
+      <w:rPr>
+        <w:u w:val="none"/>
+      </w:rPr>
+    </w:lvl>
+    <w:lvl w:ilvl="1">
+      <w:start w:val="1"/>
+      <w:numFmt w:val="lowerLetter"/>
+      <w:lvlText w:val="%2)"/>
+      <w:lvlJc w:val="left"/>
+      <w:pPr>
+        <w:ind w:left="1440" w:hanging="360"/>
+      </w:pPr>
+      <w:rPr>
+        <w:u w:val="none"/>
+      </w:rPr>
+    </w:lvl>
+    <w:lvl w:ilvl="2">
+      <w:start w:val="1"/>
+      <w:numFmt w:val="lowerRoman"/>
+      <w:lvlText w:val="%3)"/>
+      <w:lvlJc w:val="right"/>
+      <w:pPr>
+        <w:ind w:left="2160" w:hanging="360"/>
+      </w:pPr>
+      <w:rPr>
+        <w:u w:val="none"/>
+      </w:rPr>
+    </w:lvl>
+    <w:lvl w:ilvl="3">
+      <w:start w:val="1"/>
+      <w:numFmt w:val="decimal"/>
+      <w:lvlText w:val="(%4)"/>
+      <w:lvlJc w:val="left"/>
+      <w:pPr>
+        <w:ind w:left="2880" w:hanging="360"/>
+      </w:pPr>
+      <w:rPr>
+        <w:u w:val="none"/>
+      </w:rPr>
+    </w:lvl>
+    <w:lvl w:ilvl="4">
+      <w:start w:val="1"/>
+      <w:numFmt w:val="lowerLetter"/>
+      <w:lvlText w:val="(%5)"/>
+      <w:lvlJc w:val="left"/>
+      <w:pPr>
+        <w:ind w:left="3600" w:hanging="360"/>
+      </w:pPr>
+      <w:rPr>
+        <w:u w:val="none"/>
+      </w:rPr>
+    </w:lvl>
+    <w:lvl w:ilvl="5">
+      <w:start w:val="1"/>
+      <w:numFmt w:val="lowerRoman"/>
+      <w:lvlText w:val="(%6)"/>
+      <w:lvlJc w:val="right"/>
+      <w:pPr>
+        <w:ind w:left="4320" w:hanging="360"/>
+      </w:pPr>
+      <w:rPr>
+        <w:u w:val="none"/>
+      </w:rPr>
+    </w:lvl>
+    <w:lvl w:ilvl="6">
+      <w:start w:val="1"/>
+      <w:numFmt w:val="decimal"/>
+      <w:lvlText w:val="%7."/>
+      <w:lvlJc w:val="left"/>
+      <w:pPr>
+        <w:ind w:left="5040" w:hanging="360"/>
+      </w:pPr>
+      <w:rPr>
+        <w:u w:val="none"/>
+      </w:rPr>
+    </w:lvl>
+    <w:lvl w:ilvl="7">
+      <w:start w:val="1"/>
+      <w:numFmt w:val="lowerLetter"/>
+      <w:lvlText w:val="%8."/>
+      <w:lvlJc w:val="left"/>
+      <w:pPr>
+        <w:ind w:left="5760" w:hanging="360"/>
+      </w:pPr>
+      <w:rPr>
+        <w:u w:val="none"/>
+      </w:rPr>
+    </w:lvl>
+    <w:lvl w:ilvl="8">
+      <w:start w:val="1"/>
+      <w:numFmt w:val="lowerRoman"/>
+      <w:lvlText w:val="%9."/>
+      <w:lvlJc w:val="right"/>
+      <w:pPr>
+        <w:ind w:left="6480" w:hanging="360"/>
+      </w:pPr>
+      <w:rPr>
+        <w:u w:val="none"/>
+      </w:rPr>
+    </w:lvl>
+  </w:abstractNum>
+  <w:num w:numId="1">
+    <w:abstractNumId w:val="1"/>
+  </w:num>
+</w:numbering>
 </file>
 
 <file path=word/styles.xml><?xml version="1.0" encoding="utf-8"?>

</xml_diff>